<commit_message>
Update 2026_Б_ПІ_ ПЗПІ-22-9 _М'яч_К_О.docx
</commit_message>
<xml_diff>
--- a/2026_Б_ПІ_ ПЗПІ-22-9 _М'яч_К_О.docx
+++ b/2026_Б_ПІ_ ПЗПІ-22-9 _М'яч_К_О.docx
@@ -2,716 +2,6 @@
 <file path=word/document.xml><?xml version="1.0" encoding="utf-8"?>
 <w:document xmlns:wpc="http://schemas.microsoft.com/office/word/2010/wordprocessingCanvas" xmlns:cx="http://schemas.microsoft.com/office/drawing/2014/chartex" xmlns:cx1="http://schemas.microsoft.com/office/drawing/2015/9/8/chartex" xmlns:cx2="http://schemas.microsoft.com/office/drawing/2015/10/21/chartex" xmlns:cx3="http://schemas.microsoft.com/office/drawing/2016/5/9/chartex" xmlns:cx4="http://schemas.microsoft.com/office/drawing/2016/5/10/chartex" xmlns:cx5="http://schemas.microsoft.com/office/drawing/2016/5/11/chartex" xmlns:cx6="http://schemas.microsoft.com/office/drawing/2016/5/12/chartex" xmlns:cx7="http://schemas.microsoft.com/office/drawing/2016/5/13/chartex" xmlns:cx8="http://schemas.microsoft.com/office/drawing/2016/5/14/chartex" xmlns:mc="http://schemas.openxmlformats.org/markup-compatibility/2006" xmlns:aink="http://schemas.microsoft.com/office/drawing/2016/ink" xmlns:am3d="http://schemas.microsoft.com/office/drawing/2017/model3d" xmlns:o="urn:schemas-microsoft-com:office:office" xmlns:oel="http://schemas.microsoft.com/office/2019/extlst" xmlns:r="http://schemas.openxmlformats.org/officeDocument/2006/relationships" xmlns:m="http://schemas.openxmlformats.org/officeDocument/2006/math" xmlns:v="urn:schemas-microsoft-com:vml" xmlns:wp14="http://schemas.microsoft.com/office/word/2010/wordprocessingDrawing" xmlns:wp="http://schemas.openxmlformats.org/drawingml/2006/wordprocessingDrawing" xmlns:w10="urn:schemas-microsoft-com:office:word" xmlns:w="http://schemas.openxmlformats.org/wordprocessingml/2006/main" xmlns:w14="http://schemas.microsoft.com/office/word/2010/wordml" xmlns:w15="http://schemas.microsoft.com/office/word/2012/wordml" xmlns:w16cex="http://schemas.microsoft.com/office/word/2018/wordml/cex" xmlns:w16cid="http://schemas.microsoft.com/office/word/2016/wordml/cid" xmlns:w16="http://schemas.microsoft.com/office/word/2018/wordml" xmlns:w16sdtdh="http://schemas.microsoft.com/office/word/2020/wordml/sdtdatahash" xmlns:w16se="http://schemas.microsoft.com/office/word/2015/wordml/symex" xmlns:wpg="http://schemas.microsoft.com/office/word/2010/wordprocessingGroup" xmlns:wpi="http://schemas.microsoft.com/office/word/2010/wordprocessingInk" xmlns:wne="http://schemas.microsoft.com/office/word/2006/wordml" xmlns:wps="http://schemas.microsoft.com/office/word/2010/wordprocessingShape" mc:Ignorable="w14 w15 w16se w16cid w16 w16cex w16sdtdh wp14">
   <w:body>
-    <w:p>
-      <w:pPr>
-        <w:tabs>
-          <w:tab w:val="left" w:pos="720"/>
-          <w:tab w:val="left" w:pos="5760"/>
-          <w:tab w:val="left" w:pos="1520"/>
-          <w:tab w:val="left" w:pos="5940"/>
-          <w:tab w:val="left" w:pos="6300"/>
-        </w:tabs>
-        <w:spacing w:line="360" w:lineRule="auto"/>
-        <w:ind w:right="720"/>
-        <w:rPr>
-          <w:rFonts w:ascii="Times New Roman" w:eastAsia="Times New Roman" w:hAnsi="Times New Roman" w:cs="Times New Roman"/>
-          <w:b/>
-          <w:sz w:val="28"/>
-          <w:szCs w:val="28"/>
-        </w:rPr>
-      </w:pPr>
-    </w:p>
-    <w:p>
-      <w:pPr>
-        <w:tabs>
-          <w:tab w:val="left" w:pos="720"/>
-          <w:tab w:val="left" w:pos="5760"/>
-          <w:tab w:val="left" w:pos="1520"/>
-          <w:tab w:val="left" w:pos="5940"/>
-          <w:tab w:val="left" w:pos="6300"/>
-        </w:tabs>
-        <w:spacing w:line="360" w:lineRule="auto"/>
-        <w:ind w:right="720"/>
-        <w:jc w:val="center"/>
-        <w:rPr>
-          <w:rFonts w:ascii="Times New Roman" w:eastAsia="Times New Roman" w:hAnsi="Times New Roman" w:cs="Times New Roman"/>
-          <w:b/>
-          <w:sz w:val="28"/>
-          <w:szCs w:val="28"/>
-          <w:lang w:val="en-US"/>
-        </w:rPr>
-      </w:pPr>
-      <w:r>
-        <w:rPr>
-          <w:rFonts w:ascii="Times New Roman" w:eastAsia="Times New Roman" w:hAnsi="Times New Roman" w:cs="Times New Roman"/>
-          <w:b/>
-          <w:sz w:val="28"/>
-          <w:szCs w:val="28"/>
-          <w:lang w:val="en-US"/>
-        </w:rPr>
-        <w:t>CS</w:t>
-      </w:r>
-      <w:proofErr w:type="gramStart"/>
-      <w:r>
-        <w:rPr>
-          <w:rFonts w:ascii="Times New Roman" w:eastAsia="Times New Roman" w:hAnsi="Times New Roman" w:cs="Times New Roman"/>
-          <w:b/>
-          <w:sz w:val="28"/>
-          <w:szCs w:val="28"/>
-          <w:lang w:val="en-US"/>
-        </w:rPr>
-        <w:t>330  Software</w:t>
-      </w:r>
-      <w:proofErr w:type="gramEnd"/>
-      <w:r>
-        <w:rPr>
-          <w:rFonts w:ascii="Times New Roman" w:eastAsia="Times New Roman" w:hAnsi="Times New Roman" w:cs="Times New Roman"/>
-          <w:b/>
-          <w:sz w:val="28"/>
-          <w:szCs w:val="28"/>
-          <w:lang w:val="en-US"/>
-        </w:rPr>
-        <w:t xml:space="preserve"> Engineering</w:t>
-      </w:r>
-    </w:p>
-    <w:p>
-      <w:pPr>
-        <w:tabs>
-          <w:tab w:val="left" w:pos="720"/>
-          <w:tab w:val="left" w:pos="5760"/>
-          <w:tab w:val="left" w:pos="1520"/>
-          <w:tab w:val="left" w:pos="5940"/>
-          <w:tab w:val="left" w:pos="6300"/>
-        </w:tabs>
-        <w:spacing w:line="360" w:lineRule="auto"/>
-        <w:ind w:right="720"/>
-        <w:jc w:val="center"/>
-        <w:rPr>
-          <w:rFonts w:ascii="Times New Roman" w:eastAsia="Times New Roman" w:hAnsi="Times New Roman" w:cs="Times New Roman"/>
-          <w:b/>
-          <w:sz w:val="28"/>
-          <w:szCs w:val="28"/>
-          <w:lang w:val="en-US"/>
-        </w:rPr>
-      </w:pPr>
-    </w:p>
-    <w:p>
-      <w:pPr>
-        <w:tabs>
-          <w:tab w:val="left" w:pos="720"/>
-          <w:tab w:val="left" w:pos="5760"/>
-          <w:tab w:val="left" w:pos="1520"/>
-          <w:tab w:val="left" w:pos="5940"/>
-          <w:tab w:val="left" w:pos="6300"/>
-        </w:tabs>
-        <w:spacing w:line="360" w:lineRule="auto"/>
-        <w:ind w:right="720"/>
-        <w:jc w:val="center"/>
-        <w:rPr>
-          <w:rFonts w:ascii="Times New Roman" w:eastAsia="Times New Roman" w:hAnsi="Times New Roman" w:cs="Times New Roman"/>
-          <w:sz w:val="28"/>
-          <w:szCs w:val="28"/>
-          <w:lang w:val="en-US"/>
-        </w:rPr>
-      </w:pPr>
-      <w:r>
-        <w:rPr>
-          <w:rFonts w:ascii="Times New Roman" w:eastAsia="Times New Roman" w:hAnsi="Times New Roman" w:cs="Times New Roman"/>
-          <w:b/>
-          <w:sz w:val="28"/>
-          <w:szCs w:val="28"/>
-          <w:lang w:val="en-US"/>
-        </w:rPr>
-        <w:t>Software Requirements Specification (SRS) Template</w:t>
-      </w:r>
-    </w:p>
-    <w:p>
-      <w:pPr>
-        <w:tabs>
-          <w:tab w:val="left" w:pos="720"/>
-          <w:tab w:val="left" w:pos="5760"/>
-          <w:tab w:val="left" w:pos="5940"/>
-          <w:tab w:val="left" w:pos="6300"/>
-        </w:tabs>
-        <w:spacing w:line="360" w:lineRule="auto"/>
-        <w:ind w:right="720"/>
-        <w:jc w:val="both"/>
-        <w:rPr>
-          <w:rFonts w:ascii="Times New Roman" w:eastAsia="Times New Roman" w:hAnsi="Times New Roman" w:cs="Times New Roman"/>
-          <w:sz w:val="28"/>
-          <w:szCs w:val="28"/>
-          <w:lang w:val="en-US"/>
-        </w:rPr>
-      </w:pPr>
-    </w:p>
-    <w:p>
-      <w:pPr>
-        <w:tabs>
-          <w:tab w:val="left" w:pos="720"/>
-          <w:tab w:val="left" w:pos="5760"/>
-          <w:tab w:val="left" w:pos="5940"/>
-          <w:tab w:val="left" w:pos="6300"/>
-        </w:tabs>
-        <w:spacing w:line="360" w:lineRule="auto"/>
-        <w:ind w:right="720"/>
-        <w:jc w:val="both"/>
-        <w:rPr>
-          <w:rFonts w:ascii="Times New Roman" w:eastAsia="Times New Roman" w:hAnsi="Times New Roman" w:cs="Times New Roman"/>
-          <w:sz w:val="28"/>
-          <w:szCs w:val="28"/>
-          <w:lang w:val="en-US"/>
-        </w:rPr>
-      </w:pPr>
-    </w:p>
-    <w:p>
-      <w:pPr>
-        <w:tabs>
-          <w:tab w:val="left" w:pos="720"/>
-          <w:tab w:val="left" w:pos="5760"/>
-          <w:tab w:val="left" w:pos="5940"/>
-          <w:tab w:val="left" w:pos="6300"/>
-        </w:tabs>
-        <w:spacing w:line="360" w:lineRule="auto"/>
-        <w:ind w:right="720"/>
-        <w:jc w:val="both"/>
-        <w:rPr>
-          <w:rFonts w:ascii="Times New Roman" w:eastAsia="Times New Roman" w:hAnsi="Times New Roman" w:cs="Times New Roman"/>
-          <w:sz w:val="28"/>
-          <w:szCs w:val="28"/>
-          <w:lang w:val="en-US"/>
-        </w:rPr>
-      </w:pPr>
-    </w:p>
-    <w:p>
-      <w:pPr>
-        <w:pBdr>
-          <w:top w:val="single" w:sz="6" w:space="1" w:color="000000"/>
-          <w:left w:val="single" w:sz="6" w:space="1" w:color="000000"/>
-          <w:bottom w:val="single" w:sz="6" w:space="1" w:color="000000"/>
-          <w:right w:val="single" w:sz="6" w:space="1" w:color="000000"/>
-        </w:pBdr>
-        <w:tabs>
-          <w:tab w:val="left" w:pos="720"/>
-          <w:tab w:val="left" w:pos="5760"/>
-          <w:tab w:val="left" w:pos="5940"/>
-          <w:tab w:val="left" w:pos="6300"/>
-        </w:tabs>
-        <w:spacing w:line="360" w:lineRule="auto"/>
-        <w:ind w:right="720"/>
-        <w:jc w:val="both"/>
-        <w:rPr>
-          <w:rFonts w:ascii="Times New Roman" w:eastAsia="Times New Roman" w:hAnsi="Times New Roman" w:cs="Times New Roman"/>
-          <w:sz w:val="28"/>
-          <w:szCs w:val="28"/>
-          <w:lang w:val="en-US"/>
-        </w:rPr>
-      </w:pPr>
-      <w:r>
-        <w:rPr>
-          <w:rFonts w:ascii="Times New Roman" w:eastAsia="Times New Roman" w:hAnsi="Times New Roman" w:cs="Times New Roman"/>
-          <w:sz w:val="28"/>
-          <w:szCs w:val="28"/>
-          <w:lang w:val="en-US"/>
-        </w:rPr>
-        <w:t xml:space="preserve">Items that are intended to stay in as part of your document are in </w:t>
-      </w:r>
-      <w:r>
-        <w:rPr>
-          <w:rFonts w:ascii="Times New Roman" w:eastAsia="Times New Roman" w:hAnsi="Times New Roman" w:cs="Times New Roman"/>
-          <w:b/>
-          <w:sz w:val="28"/>
-          <w:szCs w:val="28"/>
-          <w:lang w:val="en-US"/>
-        </w:rPr>
-        <w:t>bold</w:t>
-      </w:r>
-      <w:r>
-        <w:rPr>
-          <w:rFonts w:ascii="Times New Roman" w:eastAsia="Times New Roman" w:hAnsi="Times New Roman" w:cs="Times New Roman"/>
-          <w:sz w:val="28"/>
-          <w:szCs w:val="28"/>
-          <w:lang w:val="en-US"/>
-        </w:rPr>
-        <w:t xml:space="preserve">; explanatory comments are in </w:t>
-      </w:r>
-      <w:r>
-        <w:rPr>
-          <w:rFonts w:ascii="Times New Roman" w:eastAsia="Times New Roman" w:hAnsi="Times New Roman" w:cs="Times New Roman"/>
-          <w:i/>
-          <w:sz w:val="28"/>
-          <w:szCs w:val="28"/>
-          <w:lang w:val="en-US"/>
-        </w:rPr>
-        <w:t>italic</w:t>
-      </w:r>
-      <w:r>
-        <w:rPr>
-          <w:rFonts w:ascii="Times New Roman" w:eastAsia="Times New Roman" w:hAnsi="Times New Roman" w:cs="Times New Roman"/>
-          <w:sz w:val="28"/>
-          <w:szCs w:val="28"/>
-          <w:lang w:val="en-US"/>
-        </w:rPr>
-        <w:t xml:space="preserve"> text.  Plain text is used where you might insert wording about your project.</w:t>
-      </w:r>
-    </w:p>
-    <w:p>
-      <w:pPr>
-        <w:tabs>
-          <w:tab w:val="left" w:pos="720"/>
-          <w:tab w:val="left" w:pos="5760"/>
-          <w:tab w:val="left" w:pos="1520"/>
-          <w:tab w:val="left" w:pos="5940"/>
-          <w:tab w:val="left" w:pos="6300"/>
-        </w:tabs>
-        <w:spacing w:line="360" w:lineRule="auto"/>
-        <w:ind w:right="720"/>
-        <w:jc w:val="both"/>
-        <w:rPr>
-          <w:rFonts w:ascii="Times New Roman" w:eastAsia="Times New Roman" w:hAnsi="Times New Roman" w:cs="Times New Roman"/>
-          <w:sz w:val="28"/>
-          <w:szCs w:val="28"/>
-          <w:lang w:val="en-US"/>
-        </w:rPr>
-      </w:pPr>
-    </w:p>
-    <w:p>
-      <w:pPr>
-        <w:tabs>
-          <w:tab w:val="left" w:pos="720"/>
-          <w:tab w:val="left" w:pos="5760"/>
-          <w:tab w:val="left" w:pos="1520"/>
-          <w:tab w:val="left" w:pos="5940"/>
-          <w:tab w:val="left" w:pos="6300"/>
-        </w:tabs>
-        <w:spacing w:line="360" w:lineRule="auto"/>
-        <w:ind w:right="720"/>
-        <w:jc w:val="both"/>
-        <w:rPr>
-          <w:rFonts w:ascii="Times New Roman" w:eastAsia="Times New Roman" w:hAnsi="Times New Roman" w:cs="Times New Roman"/>
-          <w:sz w:val="28"/>
-          <w:szCs w:val="28"/>
-          <w:lang w:val="en-US"/>
-        </w:rPr>
-      </w:pPr>
-    </w:p>
-    <w:p>
-      <w:pPr>
-        <w:tabs>
-          <w:tab w:val="left" w:pos="720"/>
-          <w:tab w:val="left" w:pos="5760"/>
-          <w:tab w:val="left" w:pos="1520"/>
-          <w:tab w:val="left" w:pos="5940"/>
-          <w:tab w:val="left" w:pos="6300"/>
-        </w:tabs>
-        <w:spacing w:line="360" w:lineRule="auto"/>
-        <w:ind w:right="720"/>
-        <w:jc w:val="both"/>
-        <w:rPr>
-          <w:rFonts w:ascii="Times New Roman" w:eastAsia="Times New Roman" w:hAnsi="Times New Roman" w:cs="Times New Roman"/>
-          <w:sz w:val="28"/>
-          <w:szCs w:val="28"/>
-          <w:lang w:val="en-US"/>
-        </w:rPr>
-      </w:pPr>
-    </w:p>
-    <w:p>
-      <w:pPr>
-        <w:tabs>
-          <w:tab w:val="left" w:pos="720"/>
-          <w:tab w:val="left" w:pos="5760"/>
-          <w:tab w:val="left" w:pos="1520"/>
-          <w:tab w:val="left" w:pos="5940"/>
-          <w:tab w:val="left" w:pos="6300"/>
-        </w:tabs>
-        <w:spacing w:line="360" w:lineRule="auto"/>
-        <w:ind w:right="720"/>
-        <w:jc w:val="both"/>
-        <w:rPr>
-          <w:rFonts w:ascii="Times New Roman" w:eastAsia="Times New Roman" w:hAnsi="Times New Roman" w:cs="Times New Roman"/>
-          <w:sz w:val="28"/>
-          <w:szCs w:val="28"/>
-          <w:lang w:val="en-US"/>
-        </w:rPr>
-      </w:pPr>
-      <w:r>
-        <w:rPr>
-          <w:rFonts w:ascii="Times New Roman" w:eastAsia="Times New Roman" w:hAnsi="Times New Roman" w:cs="Times New Roman"/>
-          <w:sz w:val="28"/>
-          <w:szCs w:val="28"/>
-          <w:lang w:val="en-US"/>
-        </w:rPr>
-        <w:t>The document in this file is an annotated outline for specifying software requirements, adapted from the IEEE Guide to Software Requirements Specifications (Std 830-1993).</w:t>
-      </w:r>
-    </w:p>
-    <w:p>
-      <w:pPr>
-        <w:tabs>
-          <w:tab w:val="left" w:pos="720"/>
-          <w:tab w:val="left" w:pos="5760"/>
-          <w:tab w:val="left" w:pos="1520"/>
-          <w:tab w:val="left" w:pos="5940"/>
-          <w:tab w:val="left" w:pos="6300"/>
-        </w:tabs>
-        <w:spacing w:line="360" w:lineRule="auto"/>
-        <w:ind w:right="720"/>
-        <w:jc w:val="both"/>
-        <w:rPr>
-          <w:rFonts w:ascii="Times New Roman" w:eastAsia="Times New Roman" w:hAnsi="Times New Roman" w:cs="Times New Roman"/>
-          <w:sz w:val="28"/>
-          <w:szCs w:val="28"/>
-          <w:lang w:val="en-US"/>
-        </w:rPr>
-      </w:pPr>
-    </w:p>
-    <w:p>
-      <w:pPr>
-        <w:tabs>
-          <w:tab w:val="left" w:pos="720"/>
-          <w:tab w:val="left" w:pos="5760"/>
-          <w:tab w:val="left" w:pos="1520"/>
-          <w:tab w:val="left" w:pos="5940"/>
-          <w:tab w:val="left" w:pos="6300"/>
-        </w:tabs>
-        <w:spacing w:line="360" w:lineRule="auto"/>
-        <w:ind w:right="720"/>
-        <w:jc w:val="both"/>
-        <w:rPr>
-          <w:rFonts w:ascii="Times New Roman" w:eastAsia="Times New Roman" w:hAnsi="Times New Roman" w:cs="Times New Roman"/>
-          <w:sz w:val="28"/>
-          <w:szCs w:val="28"/>
-          <w:lang w:val="en-US"/>
-        </w:rPr>
-      </w:pPr>
-      <w:r>
-        <w:rPr>
-          <w:rFonts w:ascii="Times New Roman" w:eastAsia="Times New Roman" w:hAnsi="Times New Roman" w:cs="Times New Roman"/>
-          <w:sz w:val="28"/>
-          <w:szCs w:val="28"/>
-          <w:lang w:val="en-US"/>
-        </w:rPr>
-        <w:t xml:space="preserve">Tailor this to your needs, removing explanatory comments as you go along.  Where you decide to omit a section, keep the header, but insert a comment saying why you omit the data. </w:t>
-      </w:r>
-    </w:p>
-    <w:p>
-      <w:pPr>
-        <w:tabs>
-          <w:tab w:val="left" w:pos="720"/>
-          <w:tab w:val="left" w:pos="5760"/>
-          <w:tab w:val="left" w:pos="1520"/>
-          <w:tab w:val="left" w:pos="5940"/>
-          <w:tab w:val="left" w:pos="6300"/>
-        </w:tabs>
-        <w:spacing w:line="360" w:lineRule="auto"/>
-        <w:ind w:right="720"/>
-        <w:jc w:val="both"/>
-        <w:rPr>
-          <w:rFonts w:ascii="Times New Roman" w:eastAsia="Times New Roman" w:hAnsi="Times New Roman" w:cs="Times New Roman"/>
-          <w:sz w:val="24"/>
-          <w:szCs w:val="24"/>
-          <w:lang w:val="en-US"/>
-        </w:rPr>
-      </w:pPr>
-    </w:p>
-    <w:p>
-      <w:pPr>
-        <w:tabs>
-          <w:tab w:val="left" w:pos="720"/>
-          <w:tab w:val="left" w:pos="5760"/>
-          <w:tab w:val="left" w:pos="1520"/>
-          <w:tab w:val="left" w:pos="5940"/>
-          <w:tab w:val="left" w:pos="6300"/>
-        </w:tabs>
-        <w:spacing w:line="360" w:lineRule="auto"/>
-        <w:ind w:right="720"/>
-        <w:jc w:val="both"/>
-        <w:rPr>
-          <w:rFonts w:ascii="Times New Roman" w:eastAsia="Times New Roman" w:hAnsi="Times New Roman" w:cs="Times New Roman"/>
-          <w:sz w:val="24"/>
-          <w:szCs w:val="24"/>
-          <w:lang w:val="en-US"/>
-        </w:rPr>
-      </w:pPr>
-    </w:p>
-    <w:p>
-      <w:pPr>
-        <w:tabs>
-          <w:tab w:val="left" w:pos="720"/>
-          <w:tab w:val="left" w:pos="5760"/>
-          <w:tab w:val="left" w:pos="1520"/>
-          <w:tab w:val="left" w:pos="5940"/>
-          <w:tab w:val="left" w:pos="6300"/>
-        </w:tabs>
-        <w:spacing w:line="360" w:lineRule="auto"/>
-        <w:ind w:right="720"/>
-        <w:jc w:val="both"/>
-        <w:rPr>
-          <w:rFonts w:ascii="Times New Roman" w:eastAsia="Times New Roman" w:hAnsi="Times New Roman" w:cs="Times New Roman"/>
-          <w:sz w:val="24"/>
-          <w:szCs w:val="24"/>
-          <w:lang w:val="en-US"/>
-        </w:rPr>
-      </w:pPr>
-    </w:p>
-    <w:p>
-      <w:pPr>
-        <w:tabs>
-          <w:tab w:val="left" w:pos="720"/>
-          <w:tab w:val="left" w:pos="5760"/>
-          <w:tab w:val="left" w:pos="1520"/>
-          <w:tab w:val="left" w:pos="5940"/>
-          <w:tab w:val="left" w:pos="6300"/>
-        </w:tabs>
-        <w:spacing w:line="360" w:lineRule="auto"/>
-        <w:ind w:right="720"/>
-        <w:jc w:val="both"/>
-        <w:rPr>
-          <w:rFonts w:ascii="Times New Roman" w:eastAsia="Times New Roman" w:hAnsi="Times New Roman" w:cs="Times New Roman"/>
-          <w:sz w:val="24"/>
-          <w:szCs w:val="24"/>
-          <w:lang w:val="en-US"/>
-        </w:rPr>
-      </w:pPr>
-    </w:p>
-    <w:p>
-      <w:pPr>
-        <w:tabs>
-          <w:tab w:val="left" w:pos="720"/>
-          <w:tab w:val="left" w:pos="5760"/>
-          <w:tab w:val="left" w:pos="1520"/>
-          <w:tab w:val="left" w:pos="5940"/>
-          <w:tab w:val="left" w:pos="6300"/>
-        </w:tabs>
-        <w:spacing w:line="360" w:lineRule="auto"/>
-        <w:ind w:right="720"/>
-        <w:jc w:val="both"/>
-        <w:rPr>
-          <w:rFonts w:ascii="Times New Roman" w:eastAsia="Times New Roman" w:hAnsi="Times New Roman" w:cs="Times New Roman"/>
-          <w:sz w:val="24"/>
-          <w:szCs w:val="24"/>
-          <w:lang w:val="en-US"/>
-        </w:rPr>
-      </w:pPr>
-    </w:p>
-    <w:p>
-      <w:pPr>
-        <w:tabs>
-          <w:tab w:val="left" w:pos="720"/>
-          <w:tab w:val="left" w:pos="5760"/>
-          <w:tab w:val="left" w:pos="1520"/>
-          <w:tab w:val="left" w:pos="5940"/>
-          <w:tab w:val="left" w:pos="6300"/>
-        </w:tabs>
-        <w:spacing w:line="360" w:lineRule="auto"/>
-        <w:ind w:right="720"/>
-        <w:jc w:val="both"/>
-        <w:rPr>
-          <w:rFonts w:ascii="Times New Roman" w:eastAsia="Times New Roman" w:hAnsi="Times New Roman" w:cs="Times New Roman"/>
-          <w:sz w:val="24"/>
-          <w:szCs w:val="24"/>
-          <w:lang w:val="en-US"/>
-        </w:rPr>
-      </w:pPr>
-    </w:p>
-    <w:p>
-      <w:pPr>
-        <w:tabs>
-          <w:tab w:val="left" w:pos="720"/>
-          <w:tab w:val="left" w:pos="5760"/>
-          <w:tab w:val="left" w:pos="1520"/>
-          <w:tab w:val="left" w:pos="5940"/>
-          <w:tab w:val="left" w:pos="6300"/>
-        </w:tabs>
-        <w:spacing w:line="360" w:lineRule="auto"/>
-        <w:ind w:right="720"/>
-        <w:jc w:val="both"/>
-        <w:rPr>
-          <w:rFonts w:ascii="Times New Roman" w:eastAsia="Times New Roman" w:hAnsi="Times New Roman" w:cs="Times New Roman"/>
-          <w:sz w:val="24"/>
-          <w:szCs w:val="24"/>
-          <w:lang w:val="en-US"/>
-        </w:rPr>
-      </w:pPr>
-    </w:p>
-    <w:p>
-      <w:pPr>
-        <w:tabs>
-          <w:tab w:val="left" w:pos="720"/>
-          <w:tab w:val="left" w:pos="5760"/>
-          <w:tab w:val="left" w:pos="1520"/>
-          <w:tab w:val="left" w:pos="5940"/>
-          <w:tab w:val="left" w:pos="6300"/>
-        </w:tabs>
-        <w:spacing w:line="360" w:lineRule="auto"/>
-        <w:ind w:right="720"/>
-        <w:jc w:val="both"/>
-        <w:rPr>
-          <w:rFonts w:ascii="Times New Roman" w:eastAsia="Times New Roman" w:hAnsi="Times New Roman" w:cs="Times New Roman"/>
-          <w:sz w:val="24"/>
-          <w:szCs w:val="24"/>
-          <w:lang w:val="en-US"/>
-        </w:rPr>
-      </w:pPr>
-    </w:p>
-    <w:p>
-      <w:pPr>
-        <w:tabs>
-          <w:tab w:val="left" w:pos="720"/>
-          <w:tab w:val="left" w:pos="5760"/>
-          <w:tab w:val="left" w:pos="1520"/>
-          <w:tab w:val="left" w:pos="5940"/>
-          <w:tab w:val="left" w:pos="6300"/>
-        </w:tabs>
-        <w:spacing w:line="360" w:lineRule="auto"/>
-        <w:ind w:right="720"/>
-        <w:jc w:val="both"/>
-        <w:rPr>
-          <w:rFonts w:ascii="Times New Roman" w:eastAsia="Times New Roman" w:hAnsi="Times New Roman" w:cs="Times New Roman"/>
-          <w:sz w:val="24"/>
-          <w:szCs w:val="24"/>
-          <w:lang w:val="en-US"/>
-        </w:rPr>
-      </w:pPr>
-    </w:p>
-    <w:p>
-      <w:pPr>
-        <w:tabs>
-          <w:tab w:val="left" w:pos="720"/>
-          <w:tab w:val="left" w:pos="5760"/>
-          <w:tab w:val="left" w:pos="1520"/>
-          <w:tab w:val="left" w:pos="5940"/>
-          <w:tab w:val="left" w:pos="6300"/>
-        </w:tabs>
-        <w:spacing w:line="360" w:lineRule="auto"/>
-        <w:ind w:right="720"/>
-        <w:jc w:val="both"/>
-        <w:rPr>
-          <w:rFonts w:ascii="Times New Roman" w:eastAsia="Times New Roman" w:hAnsi="Times New Roman" w:cs="Times New Roman"/>
-          <w:sz w:val="24"/>
-          <w:szCs w:val="24"/>
-          <w:lang w:val="en-US"/>
-        </w:rPr>
-      </w:pPr>
-    </w:p>
-    <w:p>
-      <w:pPr>
-        <w:tabs>
-          <w:tab w:val="left" w:pos="720"/>
-          <w:tab w:val="left" w:pos="5760"/>
-          <w:tab w:val="left" w:pos="1520"/>
-          <w:tab w:val="left" w:pos="5940"/>
-          <w:tab w:val="left" w:pos="6300"/>
-        </w:tabs>
-        <w:spacing w:line="360" w:lineRule="auto"/>
-        <w:ind w:right="720"/>
-        <w:jc w:val="both"/>
-        <w:rPr>
-          <w:rFonts w:ascii="Times New Roman" w:eastAsia="Times New Roman" w:hAnsi="Times New Roman" w:cs="Times New Roman"/>
-          <w:sz w:val="24"/>
-          <w:szCs w:val="24"/>
-          <w:lang w:val="en-US"/>
-        </w:rPr>
-      </w:pPr>
-    </w:p>
-    <w:p>
-      <w:pPr>
-        <w:tabs>
-          <w:tab w:val="left" w:pos="720"/>
-          <w:tab w:val="left" w:pos="5760"/>
-          <w:tab w:val="left" w:pos="1520"/>
-          <w:tab w:val="left" w:pos="5940"/>
-          <w:tab w:val="left" w:pos="6300"/>
-        </w:tabs>
-        <w:spacing w:line="360" w:lineRule="auto"/>
-        <w:ind w:right="720"/>
-        <w:jc w:val="both"/>
-        <w:rPr>
-          <w:rFonts w:ascii="Times New Roman" w:eastAsia="Times New Roman" w:hAnsi="Times New Roman" w:cs="Times New Roman"/>
-          <w:sz w:val="24"/>
-          <w:szCs w:val="24"/>
-          <w:lang w:val="en-US"/>
-        </w:rPr>
-      </w:pPr>
-    </w:p>
-    <w:p>
-      <w:pPr>
-        <w:tabs>
-          <w:tab w:val="left" w:pos="720"/>
-          <w:tab w:val="left" w:pos="5760"/>
-          <w:tab w:val="left" w:pos="1520"/>
-          <w:tab w:val="left" w:pos="5940"/>
-          <w:tab w:val="left" w:pos="6300"/>
-        </w:tabs>
-        <w:spacing w:line="360" w:lineRule="auto"/>
-        <w:ind w:right="720"/>
-        <w:jc w:val="both"/>
-        <w:rPr>
-          <w:rFonts w:ascii="Times New Roman" w:eastAsia="Times New Roman" w:hAnsi="Times New Roman" w:cs="Times New Roman"/>
-          <w:sz w:val="24"/>
-          <w:szCs w:val="24"/>
-          <w:lang w:val="en-US"/>
-        </w:rPr>
-      </w:pPr>
-    </w:p>
-    <w:p>
-      <w:pPr>
-        <w:tabs>
-          <w:tab w:val="left" w:pos="720"/>
-          <w:tab w:val="left" w:pos="5760"/>
-          <w:tab w:val="left" w:pos="1520"/>
-          <w:tab w:val="left" w:pos="5940"/>
-          <w:tab w:val="left" w:pos="6300"/>
-        </w:tabs>
-        <w:spacing w:line="360" w:lineRule="auto"/>
-        <w:ind w:right="720"/>
-        <w:jc w:val="both"/>
-        <w:rPr>
-          <w:rFonts w:ascii="Times New Roman" w:eastAsia="Times New Roman" w:hAnsi="Times New Roman" w:cs="Times New Roman"/>
-          <w:sz w:val="24"/>
-          <w:szCs w:val="24"/>
-          <w:lang w:val="en-US"/>
-        </w:rPr>
-      </w:pPr>
-    </w:p>
-    <w:p>
-      <w:pPr>
-        <w:tabs>
-          <w:tab w:val="left" w:pos="720"/>
-          <w:tab w:val="left" w:pos="5760"/>
-          <w:tab w:val="left" w:pos="1520"/>
-          <w:tab w:val="left" w:pos="5940"/>
-          <w:tab w:val="left" w:pos="6300"/>
-        </w:tabs>
-        <w:spacing w:line="360" w:lineRule="auto"/>
-        <w:ind w:right="720"/>
-        <w:jc w:val="both"/>
-        <w:rPr>
-          <w:rFonts w:ascii="Times New Roman" w:eastAsia="Times New Roman" w:hAnsi="Times New Roman" w:cs="Times New Roman"/>
-          <w:sz w:val="24"/>
-          <w:szCs w:val="24"/>
-          <w:lang w:val="en-US"/>
-        </w:rPr>
-      </w:pPr>
-    </w:p>
-    <w:p>
-      <w:pPr>
-        <w:tabs>
-          <w:tab w:val="left" w:pos="720"/>
-          <w:tab w:val="left" w:pos="5760"/>
-          <w:tab w:val="left" w:pos="1520"/>
-          <w:tab w:val="left" w:pos="5940"/>
-          <w:tab w:val="left" w:pos="6300"/>
-        </w:tabs>
-        <w:spacing w:line="360" w:lineRule="auto"/>
-        <w:ind w:right="720"/>
-        <w:jc w:val="center"/>
-        <w:rPr>
-          <w:rFonts w:ascii="Times New Roman" w:eastAsia="Times New Roman" w:hAnsi="Times New Roman" w:cs="Times New Roman"/>
-          <w:sz w:val="24"/>
-          <w:szCs w:val="24"/>
-          <w:lang w:val="en-US"/>
-        </w:rPr>
-      </w:pPr>
-    </w:p>
     <w:p>
       <w:pPr>
         <w:tabs>
@@ -3292,7 +2582,6 @@
           <w:rFonts w:ascii="Times New Roman" w:eastAsia="Times New Roman" w:hAnsi="Times New Roman" w:cs="Times New Roman"/>
           <w:sz w:val="24"/>
           <w:szCs w:val="24"/>
-          <w:lang/>
         </w:rPr>
       </w:pPr>
     </w:p>
@@ -3717,15 +3006,15 @@
         <w:jc w:val="both"/>
         <w:rPr>
           <w:rFonts w:ascii="Times New Roman" w:eastAsia="Times New Roman" w:hAnsi="Times New Roman" w:cs="Times New Roman"/>
-          <w:lang w:val="en-US"/>
-        </w:rPr>
-      </w:pPr>
-      <w:proofErr w:type="spellStart"/>
-      <w:r>
-        <w:rPr>
-          <w:rFonts w:ascii="Times New Roman" w:eastAsia="Times New Roman" w:hAnsi="Times New Roman" w:cs="Times New Roman"/>
           <w:lang w:val="uk-UA"/>
         </w:rPr>
+      </w:pPr>
+      <w:proofErr w:type="spellStart"/>
+      <w:r>
+        <w:rPr>
+          <w:rFonts w:ascii="Times New Roman" w:eastAsia="Times New Roman" w:hAnsi="Times New Roman" w:cs="Times New Roman"/>
+          <w:lang w:val="uk-UA"/>
+        </w:rPr>
         <w:t>Проєкт</w:t>
       </w:r>
       <w:proofErr w:type="spellEnd"/>
@@ -4032,7 +3321,6 @@
         <w:jc w:val="both"/>
         <w:rPr>
           <w:rFonts w:ascii="Times New Roman" w:eastAsia="Times New Roman" w:hAnsi="Times New Roman" w:cs="Times New Roman"/>
-          <w:lang/>
         </w:rPr>
       </w:pPr>
       <w:r>
@@ -4045,7 +3333,6 @@
       <w:r>
         <w:rPr>
           <w:rFonts w:ascii="Times New Roman" w:eastAsia="Times New Roman" w:hAnsi="Times New Roman" w:cs="Times New Roman"/>
-          <w:lang/>
         </w:rPr>
         <w:t>Штучний інтелект – програмний комплекс (LLM) для моделювання природно-мовного спілкування.</w:t>
       </w:r>
@@ -4057,7 +3344,6 @@
         <w:jc w:val="both"/>
         <w:rPr>
           <w:rFonts w:ascii="Times New Roman" w:eastAsia="Times New Roman" w:hAnsi="Times New Roman" w:cs="Times New Roman"/>
-          <w:lang/>
         </w:rPr>
       </w:pPr>
       <w:r>
@@ -4070,7 +3356,6 @@
       <w:r>
         <w:rPr>
           <w:rFonts w:ascii="Times New Roman" w:eastAsia="Times New Roman" w:hAnsi="Times New Roman" w:cs="Times New Roman"/>
-          <w:lang/>
         </w:rPr>
         <w:t>REST – архітектурний стиль побудови мережевих інтерфейсів.</w:t>
       </w:r>
@@ -4082,22 +3367,28 @@
         <w:jc w:val="both"/>
         <w:rPr>
           <w:rFonts w:ascii="Times New Roman" w:eastAsia="Times New Roman" w:hAnsi="Times New Roman" w:cs="Times New Roman"/>
-          <w:lang/>
-        </w:rPr>
-      </w:pPr>
-      <w:r>
-        <w:rPr>
-          <w:rFonts w:ascii="Times New Roman" w:eastAsia="Times New Roman" w:hAnsi="Times New Roman" w:cs="Times New Roman"/>
           <w:lang w:val="uk-UA"/>
         </w:rPr>
+      </w:pPr>
+      <w:r>
+        <w:rPr>
+          <w:rFonts w:ascii="Times New Roman" w:eastAsia="Times New Roman" w:hAnsi="Times New Roman" w:cs="Times New Roman"/>
+          <w:lang w:val="uk-UA"/>
+        </w:rPr>
         <w:tab/>
       </w:r>
       <w:r>
         <w:rPr>
           <w:rFonts w:ascii="Times New Roman" w:eastAsia="Times New Roman" w:hAnsi="Times New Roman" w:cs="Times New Roman"/>
-          <w:lang/>
-        </w:rPr>
-        <w:t>JWT – засіб безпечної автентифікації на основі токенів.</w:t>
+        </w:rPr>
+        <w:t>JWT </w:t>
+      </w:r>
+      <w:r>
+        <w:rPr>
+          <w:rFonts w:ascii="Times New Roman" w:eastAsia="Times New Roman" w:hAnsi="Times New Roman" w:cs="Times New Roman"/>
+          <w:lang w:val="uk-UA"/>
+        </w:rPr>
+        <w:t>– засіб безпечної автентифікації на основі токенів.</w:t>
       </w:r>
     </w:p>
     <w:p>
@@ -4107,22 +3398,41 @@
         <w:jc w:val="both"/>
         <w:rPr>
           <w:rFonts w:ascii="Times New Roman" w:eastAsia="Times New Roman" w:hAnsi="Times New Roman" w:cs="Times New Roman"/>
-          <w:lang/>
-        </w:rPr>
-      </w:pPr>
-      <w:r>
-        <w:rPr>
-          <w:rFonts w:ascii="Times New Roman" w:eastAsia="Times New Roman" w:hAnsi="Times New Roman" w:cs="Times New Roman"/>
           <w:lang w:val="uk-UA"/>
         </w:rPr>
+      </w:pPr>
+      <w:r>
+        <w:rPr>
+          <w:rFonts w:ascii="Times New Roman" w:eastAsia="Times New Roman" w:hAnsi="Times New Roman" w:cs="Times New Roman"/>
+          <w:lang w:val="uk-UA"/>
+        </w:rPr>
         <w:tab/>
       </w:r>
       <w:r>
         <w:rPr>
           <w:rFonts w:ascii="Times New Roman" w:eastAsia="Times New Roman" w:hAnsi="Times New Roman" w:cs="Times New Roman"/>
-          <w:lang/>
-        </w:rPr>
-        <w:t>ASR та TTS – технології розпізнавання та синтезу мовлення відповідно.</w:t>
+        </w:rPr>
+        <w:t>ASR</w:t>
+      </w:r>
+      <w:r>
+        <w:rPr>
+          <w:rFonts w:ascii="Times New Roman" w:eastAsia="Times New Roman" w:hAnsi="Times New Roman" w:cs="Times New Roman"/>
+          <w:lang w:val="uk-UA"/>
+        </w:rPr>
+        <w:t xml:space="preserve"> та </w:t>
+      </w:r>
+      <w:r>
+        <w:rPr>
+          <w:rFonts w:ascii="Times New Roman" w:eastAsia="Times New Roman" w:hAnsi="Times New Roman" w:cs="Times New Roman"/>
+        </w:rPr>
+        <w:t>TTS </w:t>
+      </w:r>
+      <w:r>
+        <w:rPr>
+          <w:rFonts w:ascii="Times New Roman" w:eastAsia="Times New Roman" w:hAnsi="Times New Roman" w:cs="Times New Roman"/>
+          <w:lang w:val="uk-UA"/>
+        </w:rPr>
+        <w:t>– технології розпізнавання та синтезу мовлення відповідно.</w:t>
       </w:r>
     </w:p>
     <w:p>
@@ -4145,7 +3455,6 @@
       <w:r>
         <w:rPr>
           <w:rFonts w:ascii="Times New Roman" w:eastAsia="Times New Roman" w:hAnsi="Times New Roman" w:cs="Times New Roman"/>
-          <w:lang/>
         </w:rPr>
         <w:t>XP – бали досвіду в системі гейміфікації.</w:t>
       </w:r>
@@ -4157,7 +3466,6 @@
         <w:jc w:val="both"/>
         <w:rPr>
           <w:rFonts w:ascii="Times New Roman" w:eastAsia="Times New Roman" w:hAnsi="Times New Roman" w:cs="Times New Roman"/>
-          <w:lang/>
         </w:rPr>
       </w:pPr>
     </w:p>
@@ -4252,13 +3560,11 @@
         <w:jc w:val="both"/>
         <w:rPr>
           <w:rFonts w:ascii="Times New Roman" w:eastAsia="Times New Roman" w:hAnsi="Times New Roman" w:cs="Times New Roman"/>
-          <w:lang/>
-        </w:rPr>
-      </w:pPr>
-      <w:r>
-        <w:rPr>
-          <w:rFonts w:ascii="Times New Roman" w:eastAsia="Times New Roman" w:hAnsi="Times New Roman" w:cs="Times New Roman"/>
-          <w:lang/>
+        </w:rPr>
+      </w:pPr>
+      <w:r>
+        <w:rPr>
+          <w:rFonts w:ascii="Times New Roman" w:eastAsia="Times New Roman" w:hAnsi="Times New Roman" w:cs="Times New Roman"/>
         </w:rPr>
         <w:t>Проєктований веб</w:t>
       </w:r>
@@ -4272,7 +3578,6 @@
       <w:r>
         <w:rPr>
           <w:rFonts w:ascii="Times New Roman" w:eastAsia="Times New Roman" w:hAnsi="Times New Roman" w:cs="Times New Roman"/>
-          <w:lang/>
         </w:rPr>
         <w:t>застосунок є масштабованим рішенням. У майбутньому можливе додавання нових мовних пар, впровадження соціальних механік змагання між групами користувачів та інтеграція модулів поглибленої освітньої аналітики.</w:t>
       </w:r>
@@ -5033,13 +4338,11 @@
         <w:jc w:val="both"/>
         <w:rPr>
           <w:rFonts w:ascii="Times New Roman" w:eastAsia="Times New Roman" w:hAnsi="Times New Roman" w:cs="Times New Roman"/>
-          <w:lang/>
-        </w:rPr>
-      </w:pPr>
-      <w:r>
-        <w:rPr>
-          <w:rFonts w:ascii="Times New Roman" w:eastAsia="Times New Roman" w:hAnsi="Times New Roman" w:cs="Times New Roman"/>
-          <w:lang/>
+        </w:rPr>
+      </w:pPr>
+      <w:r>
+        <w:rPr>
+          <w:rFonts w:ascii="Times New Roman" w:eastAsia="Times New Roman" w:hAnsi="Times New Roman" w:cs="Times New Roman"/>
         </w:rPr>
         <w:t xml:space="preserve">Проєкт передбачає взаємодію з двома основними категоріями користувачів, кожна з яких має специфічний набір технічних компетенцій, прав доступу та цілей використання програмної системи. </w:t>
       </w:r>
@@ -5054,41 +4357,35 @@
         <w:jc w:val="both"/>
         <w:rPr>
           <w:rFonts w:ascii="Times New Roman" w:eastAsia="Times New Roman" w:hAnsi="Times New Roman" w:cs="Times New Roman"/>
-          <w:lang/>
-        </w:rPr>
-      </w:pPr>
-      <w:r>
-        <w:rPr>
-          <w:rFonts w:ascii="Times New Roman" w:eastAsia="Times New Roman" w:hAnsi="Times New Roman" w:cs="Times New Roman"/>
-          <w:lang/>
+        </w:rPr>
+      </w:pPr>
+      <w:r>
+        <w:rPr>
+          <w:rFonts w:ascii="Times New Roman" w:eastAsia="Times New Roman" w:hAnsi="Times New Roman" w:cs="Times New Roman"/>
         </w:rPr>
         <w:t>Перша категорія – кінцеві користувачі, які прагнуть покращити свій рівень володіння англійською мовою та подолати мовний бар’єр. Від цієї групи очікується базовий рівень комп’ютерної грамотності, що включає навички роботи з сучасними веб</w:t>
       </w:r>
       <w:r>
         <w:rPr>
           <w:rFonts w:ascii="Times New Roman" w:eastAsia="Times New Roman" w:hAnsi="Times New Roman" w:cs="Times New Roman"/>
-          <w:lang/>
         </w:rPr>
         <w:t>-</w:t>
       </w:r>
       <w:r>
         <w:rPr>
           <w:rFonts w:ascii="Times New Roman" w:eastAsia="Times New Roman" w:hAnsi="Times New Roman" w:cs="Times New Roman"/>
-          <w:lang/>
         </w:rPr>
         <w:t>браузерами, розуміння принципів навігації у веб</w:t>
       </w:r>
       <w:r>
         <w:rPr>
           <w:rFonts w:ascii="Times New Roman" w:eastAsia="Times New Roman" w:hAnsi="Times New Roman" w:cs="Times New Roman"/>
-          <w:lang/>
         </w:rPr>
         <w:t>-</w:t>
       </w:r>
       <w:r>
         <w:rPr>
           <w:rFonts w:ascii="Times New Roman" w:eastAsia="Times New Roman" w:hAnsi="Times New Roman" w:cs="Times New Roman"/>
-          <w:lang/>
         </w:rPr>
         <w:t xml:space="preserve">застосунках та вміння керувати апаратними периферійними пристроями, такими як мікрофон та засоби відтворення звуку. Основна мета цієї групи полягає у систематичному проходженні інтерактивних вправ, накопиченні ігрового досвіду та отриманні регулярної розмовної практики з AI-асистентом. Для цієї категорії користувачів критично важливою є інтуїтивність інтерфейсу, </w:t>
       </w:r>
@@ -5102,7 +4399,6 @@
       <w:r>
         <w:rPr>
           <w:rFonts w:ascii="Times New Roman" w:eastAsia="Times New Roman" w:hAnsi="Times New Roman" w:cs="Times New Roman"/>
-          <w:lang/>
         </w:rPr>
         <w:t xml:space="preserve"> їхня увага має бути зосереджена на навчальному контенті, а не на технічних особливостях роботи системи.</w:t>
       </w:r>
@@ -5117,13 +4413,11 @@
         <w:jc w:val="both"/>
         <w:rPr>
           <w:rFonts w:ascii="Times New Roman" w:eastAsia="Times New Roman" w:hAnsi="Times New Roman" w:cs="Times New Roman"/>
-          <w:lang/>
-        </w:rPr>
-      </w:pPr>
-      <w:r>
-        <w:rPr>
-          <w:rFonts w:ascii="Times New Roman" w:eastAsia="Times New Roman" w:hAnsi="Times New Roman" w:cs="Times New Roman"/>
-          <w:lang/>
+        </w:rPr>
+      </w:pPr>
+      <w:r>
+        <w:rPr>
+          <w:rFonts w:ascii="Times New Roman" w:eastAsia="Times New Roman" w:hAnsi="Times New Roman" w:cs="Times New Roman"/>
         </w:rPr>
         <w:t xml:space="preserve">Друга категорія – адміністратори системи. Це технічно підготовлені користувачі, відповідальні за модерацію навчального контенту та контроль за стабільністю роботи системи. Для цієї групи реалізовано спеціалізований адміністративний інтерфейс. Адміністратори повинні володіти навичками роботи з інструментами редагування контенту, розуміти структуру тематичних модулів та вміти налаштовувати параметри ігрової логіки. До їхніх обов’язків належить додавання нових тем для AI-діалогів, конфігурація швидких підказок для чату та корегування балансу нарахування винагород. </w:t>
       </w:r>
@@ -5208,50 +4502,13 @@
         <w:jc w:val="both"/>
         <w:rPr>
           <w:rFonts w:ascii="Times New Roman" w:eastAsia="Times New Roman" w:hAnsi="Times New Roman" w:cs="Times New Roman"/>
-          <w:lang/>
-        </w:rPr>
-      </w:pPr>
-      <w:r>
-        <w:rPr>
-          <w:rFonts w:ascii="Times New Roman" w:eastAsia="Times New Roman" w:hAnsi="Times New Roman" w:cs="Times New Roman"/>
-          <w:lang/>
-        </w:rPr>
-        <w:t xml:space="preserve">Ефективне функціонування програмної системи зумовлене низкою технічних та архітектурних обмежень. Першочерговим фактором є залежність від стабільності та пропускної здатності мережевого з’єднання, </w:t>
-      </w:r>
-      <w:r>
-        <w:rPr>
-          <w:rFonts w:ascii="Times New Roman" w:eastAsia="Times New Roman" w:hAnsi="Times New Roman" w:cs="Times New Roman"/>
-          <w:lang/>
-        </w:rPr>
-        <w:t>тому що</w:t>
-      </w:r>
-      <w:r>
-        <w:rPr>
-          <w:rFonts w:ascii="Times New Roman" w:eastAsia="Times New Roman" w:hAnsi="Times New Roman" w:cs="Times New Roman"/>
-          <w:lang/>
-        </w:rPr>
-        <w:t xml:space="preserve"> ключові функції, такі як інтерактивний чат із ШІ та отримання навчальних вправ, реалізовані через асинхронні запити до зовнішніх та внутрішніх API.</w:t>
-      </w:r>
-      <w:r>
-        <w:rPr>
-          <w:rFonts w:ascii="Times New Roman" w:eastAsia="Times New Roman" w:hAnsi="Times New Roman" w:cs="Times New Roman"/>
-          <w:lang/>
-        </w:rPr>
-        <w:t xml:space="preserve"> </w:t>
-      </w:r>
-      <w:r>
-        <w:rPr>
-          <w:rFonts w:ascii="Times New Roman" w:eastAsia="Times New Roman" w:hAnsi="Times New Roman" w:cs="Times New Roman"/>
-          <w:lang/>
-        </w:rPr>
-        <w:t>З точки зору зберігання даних, використання реляційної СУБД SQLite на етапі розробки накладає певні обмеження на масштабованість при одночасному доступі великої кількості користувачів</w:t>
-      </w:r>
-      <w:r>
-        <w:rPr>
-          <w:rFonts w:ascii="Times New Roman" w:eastAsia="Times New Roman" w:hAnsi="Times New Roman" w:cs="Times New Roman"/>
-          <w:lang/>
-        </w:rPr>
-        <w:t>.</w:t>
+        </w:rPr>
+      </w:pPr>
+      <w:r>
+        <w:rPr>
+          <w:rFonts w:ascii="Times New Roman" w:eastAsia="Times New Roman" w:hAnsi="Times New Roman" w:cs="Times New Roman"/>
+        </w:rPr>
+        <w:t>Ефективне функціонування програмної системи зумовлене низкою технічних та архітектурних обмежень. Першочерговим фактором є залежність від стабільності та пропускної здатності мережевого з’єднання, тому що ключові функції, такі як інтерактивний чат із ШІ та отримання навчальних вправ, реалізовані через асинхронні запити до зовнішніх та внутрішніх API. З точки зору зберігання даних, використання реляційної СУБД SQLite на етапі розробки накладає певні обмеження на масштабованість при одночасному доступі великої кількості користувачів.</w:t>
       </w:r>
     </w:p>
     <w:p>
@@ -5270,7 +4527,6 @@
       <w:r>
         <w:rPr>
           <w:rFonts w:ascii="Times New Roman" w:eastAsia="Times New Roman" w:hAnsi="Times New Roman" w:cs="Times New Roman"/>
-          <w:lang/>
         </w:rPr>
         <w:t xml:space="preserve">Також існують обмеження на стороні клієнта: працездатність модулів розпізнавання та синтезу мовлення безпосередньо залежить від версії та типу веб-браузера. Програмний продукт орієнтований на сучасні версії оглядачів, що повноцінно підтримують стандарт Web Speech API. </w:t>
       </w:r>
@@ -5364,13 +4620,11 @@
         <w:jc w:val="both"/>
         <w:rPr>
           <w:rFonts w:ascii="Times New Roman" w:eastAsia="Times New Roman" w:hAnsi="Times New Roman" w:cs="Times New Roman"/>
-          <w:lang/>
-        </w:rPr>
-      </w:pPr>
-      <w:r>
-        <w:rPr>
-          <w:rFonts w:ascii="Times New Roman" w:eastAsia="Times New Roman" w:hAnsi="Times New Roman" w:cs="Times New Roman"/>
-          <w:lang/>
+        </w:rPr>
+      </w:pPr>
+      <w:r>
+        <w:rPr>
+          <w:rFonts w:ascii="Times New Roman" w:eastAsia="Times New Roman" w:hAnsi="Times New Roman" w:cs="Times New Roman"/>
         </w:rPr>
         <w:t>Коректна робота розмовного модуля системи ґрунтується на припущенні, що користувач володіє справним апаратним забезпеченням для введення та виведення звуку та надав відповідні системні дозволи у браузері. Будь-яке обмеження доступу до медіа-пристроїв на рівні операційної системи призведе до неможливості використання функцій голосової практики.</w:t>
       </w:r>
@@ -5385,13 +4639,11 @@
         <w:jc w:val="both"/>
         <w:rPr>
           <w:rFonts w:ascii="Times New Roman" w:eastAsia="Times New Roman" w:hAnsi="Times New Roman" w:cs="Times New Roman"/>
-          <w:lang/>
-        </w:rPr>
-      </w:pPr>
-      <w:r>
-        <w:rPr>
-          <w:rFonts w:ascii="Times New Roman" w:eastAsia="Times New Roman" w:hAnsi="Times New Roman" w:cs="Times New Roman"/>
-          <w:lang/>
+        </w:rPr>
+      </w:pPr>
+      <w:r>
+        <w:rPr>
+          <w:rFonts w:ascii="Times New Roman" w:eastAsia="Times New Roman" w:hAnsi="Times New Roman" w:cs="Times New Roman"/>
         </w:rPr>
         <w:t xml:space="preserve">Програмна система має критичну залежність від стороннього постачальника послуг штучного інтелекту </w:t>
       </w:r>
@@ -5405,7 +4657,6 @@
       <w:r>
         <w:rPr>
           <w:rFonts w:ascii="Times New Roman" w:eastAsia="Times New Roman" w:hAnsi="Times New Roman" w:cs="Times New Roman"/>
-          <w:lang/>
         </w:rPr>
         <w:t xml:space="preserve"> OpenRouter API. Стабільність функціонування модуля AI Learning Assistant безпосередньо пов'язана з доступністю їхніх серверів та незмінністю протоколів взаємодії. Зміна API-інтерфейсів або тарифних планів провайдера може вимагати термінової модернізації інтеграційного шару серверної частини. </w:t>
       </w:r>
@@ -5426,7 +4677,6 @@
       <w:r>
         <w:rPr>
           <w:rFonts w:ascii="Times New Roman" w:eastAsia="Times New Roman" w:hAnsi="Times New Roman" w:cs="Times New Roman"/>
-          <w:lang/>
         </w:rPr>
         <w:t xml:space="preserve"> </w:t>
       </w:r>
@@ -5615,13 +4865,11 @@
         <w:jc w:val="both"/>
         <w:rPr>
           <w:rFonts w:ascii="Times New Roman" w:eastAsia="Times New Roman" w:hAnsi="Times New Roman" w:cs="Times New Roman"/>
-          <w:lang/>
-        </w:rPr>
-      </w:pPr>
-      <w:r>
-        <w:rPr>
-          <w:rFonts w:ascii="Times New Roman" w:eastAsia="Times New Roman" w:hAnsi="Times New Roman" w:cs="Times New Roman"/>
-          <w:lang/>
+        </w:rPr>
+      </w:pPr>
+      <w:r>
+        <w:rPr>
+          <w:rFonts w:ascii="Times New Roman" w:eastAsia="Times New Roman" w:hAnsi="Times New Roman" w:cs="Times New Roman"/>
         </w:rPr>
         <w:t>У межах проєкту реалізовано динамічний та адаптивний інтерфейс на базі бібліотеки React. Програмна оболонка повинна забезпечувати візуальну плавність переходів між навчальними модулями. Дизайн інтерфейсу має відповідати вимогам сучасної ергономіки: основні елементи управління повинні бути легкодоступними. Навігаційна структура спроектована таким чином, щоб користувач міг перемикатися між різними типами вправ та профілем за мінімальну кількість кліків. Також приділено особливу увагу візуалізації результатів: кожна дія користувача повинна супроводжуватися миттєвим фідбеком, а помилки в діалогах мають виділятися зрозумілими текстовими підказками.</w:t>
       </w:r>
@@ -5661,7 +4909,6 @@
           <w:rFonts w:ascii="Times New Roman" w:eastAsia="Times New Roman" w:hAnsi="Times New Roman" w:cs="Times New Roman"/>
           <w:sz w:val="24"/>
           <w:szCs w:val="24"/>
-          <w:lang/>
         </w:rPr>
         <w:lastRenderedPageBreak/>
         <w:t xml:space="preserve">         </w:t>
@@ -5728,21 +4975,19 @@
         <w:jc w:val="both"/>
         <w:rPr>
           <w:rFonts w:ascii="Times New Roman" w:eastAsia="Times New Roman" w:hAnsi="Times New Roman" w:cs="Times New Roman"/>
-          <w:lang/>
-        </w:rPr>
-      </w:pPr>
-      <w:r>
-        <w:rPr>
-          <w:rFonts w:ascii="Times New Roman" w:eastAsia="Times New Roman" w:hAnsi="Times New Roman" w:cs="Times New Roman"/>
-          <w:sz w:val="24"/>
-          <w:szCs w:val="24"/>
-        </w:rPr>
-        <w:t xml:space="preserve"> </w:t>
-      </w:r>
-      <w:r>
-        <w:rPr>
-          <w:rFonts w:ascii="Times New Roman" w:eastAsia="Times New Roman" w:hAnsi="Times New Roman" w:cs="Times New Roman"/>
-          <w:lang/>
+        </w:rPr>
+      </w:pPr>
+      <w:r>
+        <w:rPr>
+          <w:rFonts w:ascii="Times New Roman" w:eastAsia="Times New Roman" w:hAnsi="Times New Roman" w:cs="Times New Roman"/>
+          <w:sz w:val="24"/>
+          <w:szCs w:val="24"/>
+        </w:rPr>
+        <w:t xml:space="preserve"> </w:t>
+      </w:r>
+      <w:r>
+        <w:rPr>
+          <w:rFonts w:ascii="Times New Roman" w:eastAsia="Times New Roman" w:hAnsi="Times New Roman" w:cs="Times New Roman"/>
         </w:rPr>
         <w:t>Веб-застосунок має демонструвати стабільну працездатність на персональних комп’ютерах та мобільних пристроях із доступом до мережі. Для реалізації функцій голосового введення система повинна інтегруватися зі стандартними аудіо-периферійними пристроями. Обробка аудіосигналів здійснюється на базі Web Audio API, що потребує наявності мікрофона з підтримкою частоти дискретизації, достатньої для якісного розпізнавання мовлення алгоритмами ШІ. Система повинна автоматично розпізнавати підключення/відключення гарнітури та коректно обробляти відсутність пристроїв введення, не допускаючи аварійного завершення роботи програми.</w:t>
       </w:r>
@@ -5838,21 +5083,19 @@
         <w:jc w:val="both"/>
         <w:rPr>
           <w:rFonts w:ascii="Times New Roman" w:eastAsia="Times New Roman" w:hAnsi="Times New Roman" w:cs="Times New Roman"/>
-          <w:lang/>
-        </w:rPr>
-      </w:pPr>
-      <w:r>
-        <w:rPr>
-          <w:rFonts w:ascii="Times New Roman" w:eastAsia="Times New Roman" w:hAnsi="Times New Roman" w:cs="Times New Roman"/>
-          <w:sz w:val="24"/>
-          <w:szCs w:val="24"/>
-        </w:rPr>
-        <w:t xml:space="preserve"> </w:t>
-      </w:r>
-      <w:r>
-        <w:rPr>
-          <w:rFonts w:ascii="Times New Roman" w:eastAsia="Times New Roman" w:hAnsi="Times New Roman" w:cs="Times New Roman"/>
-          <w:lang/>
+        </w:rPr>
+      </w:pPr>
+      <w:r>
+        <w:rPr>
+          <w:rFonts w:ascii="Times New Roman" w:eastAsia="Times New Roman" w:hAnsi="Times New Roman" w:cs="Times New Roman"/>
+          <w:sz w:val="24"/>
+          <w:szCs w:val="24"/>
+        </w:rPr>
+        <w:t xml:space="preserve"> </w:t>
+      </w:r>
+      <w:r>
+        <w:rPr>
+          <w:rFonts w:ascii="Times New Roman" w:eastAsia="Times New Roman" w:hAnsi="Times New Roman" w:cs="Times New Roman"/>
         </w:rPr>
         <w:t>Взаємодія між клієнтською та серверною частинами здійснюється через REST API. Кожен запит до сервера повинен містити JWT-токен у заголовку для ідентифікації сесії. Передача даних реалізована у структурованому форматі JSON. Серверна частина повинна забезпечувати обробку стандартних HTTP-статусів: 200/201 для успішних операцій, 401 для неавторизованого доступу</w:t>
       </w:r>
@@ -5866,7 +5109,6 @@
       <w:r>
         <w:rPr>
           <w:rFonts w:ascii="Times New Roman" w:eastAsia="Times New Roman" w:hAnsi="Times New Roman" w:cs="Times New Roman"/>
-          <w:lang/>
         </w:rPr>
         <w:t>та 500 для інформування про критичні помилки на рівні бази даних чи зовнішніх AI-сервісів. Також реалізована інтеграція з зовнішнім OpenRouter API для отримання текстових генерацій від мовних моделей.</w:t>
       </w:r>
@@ -5883,7 +5125,6 @@
           <w:rFonts w:ascii="Times New Roman" w:eastAsia="Times New Roman" w:hAnsi="Times New Roman" w:cs="Times New Roman"/>
           <w:sz w:val="20"/>
           <w:szCs w:val="20"/>
-          <w:lang/>
         </w:rPr>
       </w:pPr>
     </w:p>
@@ -5906,7 +5147,6 @@
           <w:rFonts w:ascii="Times New Roman" w:eastAsia="Times New Roman" w:hAnsi="Times New Roman" w:cs="Times New Roman"/>
           <w:sz w:val="24"/>
           <w:szCs w:val="24"/>
-          <w:lang/>
         </w:rPr>
         <w:t xml:space="preserve">         </w:t>
       </w:r>
@@ -5974,7 +5214,6 @@
       <w:r>
         <w:rPr>
           <w:rFonts w:ascii="Times New Roman" w:eastAsia="Times New Roman" w:hAnsi="Times New Roman" w:cs="Times New Roman"/>
-          <w:lang/>
         </w:rPr>
         <w:t>Для забезпечення високого рівня безпеки та запобігання перехопленню конфіденційної інформації, увесь мережевий трафік має бути захищений за допомогою протоколу HTTPS. Взаємодія з AI-моделями на рівні сервера також відбувається через шифровані канали зв’язку, що гарантує цілісність даних під час обміну повідомленнями.</w:t>
       </w:r>
@@ -5991,7 +5230,6 @@
           <w:rFonts w:ascii="Times New Roman" w:eastAsia="Times New Roman" w:hAnsi="Times New Roman" w:cs="Times New Roman"/>
           <w:sz w:val="20"/>
           <w:szCs w:val="20"/>
-          <w:lang/>
         </w:rPr>
       </w:pPr>
     </w:p>
@@ -6014,7 +5252,6 @@
           <w:rFonts w:ascii="Times New Roman" w:eastAsia="Times New Roman" w:hAnsi="Times New Roman" w:cs="Times New Roman"/>
           <w:sz w:val="20"/>
           <w:szCs w:val="20"/>
-          <w:lang/>
         </w:rPr>
         <w:t xml:space="preserve">     </w:t>
       </w:r>
@@ -6023,7 +5260,6 @@
           <w:rFonts w:ascii="Times New Roman" w:eastAsia="Times New Roman" w:hAnsi="Times New Roman" w:cs="Times New Roman"/>
           <w:sz w:val="24"/>
           <w:szCs w:val="24"/>
-          <w:lang/>
         </w:rPr>
         <w:t xml:space="preserve">    </w:t>
       </w:r>
@@ -6089,20 +5325,17 @@
         <w:jc w:val="both"/>
         <w:rPr>
           <w:rFonts w:ascii="Times New Roman" w:eastAsia="Times New Roman" w:hAnsi="Times New Roman" w:cs="Times New Roman"/>
-          <w:lang/>
-        </w:rPr>
-      </w:pPr>
-      <w:r>
-        <w:rPr>
-          <w:rFonts w:ascii="Times New Roman" w:eastAsia="Times New Roman" w:hAnsi="Times New Roman" w:cs="Times New Roman"/>
-          <w:lang/>
+        </w:rPr>
+      </w:pPr>
+      <w:r>
+        <w:rPr>
+          <w:rFonts w:ascii="Times New Roman" w:eastAsia="Times New Roman" w:hAnsi="Times New Roman" w:cs="Times New Roman"/>
         </w:rPr>
         <w:t>Програмний продукт оптимізовано для ефективного використання ресурсів обчислювальної системи. Для клієнтської частини обсяг споживання оперативної пам’яті браузером не повинен перевищувати 512 МБ під час активної роботи модулів голосової взаємодії та ігрових анімацій. На рівні серверної частини середовище виконання Node.js повинно стабільно опрацьовувати вхідні потоки даних та запити до СУБД SQLite, мінімізуючи накладні витрати на зберігання тимчасових об'єктів у пам'яті та запобігаючи витокам пам’яті при тривалій експлуатації.</w:t>
       </w:r>
       <w:r>
         <w:rPr>
           <w:rFonts w:ascii="Times New Roman" w:eastAsia="Times New Roman" w:hAnsi="Times New Roman" w:cs="Times New Roman"/>
-          <w:lang/>
         </w:rPr>
         <w:t xml:space="preserve"> </w:t>
       </w:r>
@@ -6190,7 +5423,6 @@
           <w:rFonts w:ascii="Times New Roman" w:eastAsia="Times New Roman" w:hAnsi="Times New Roman" w:cs="Times New Roman"/>
           <w:sz w:val="24"/>
           <w:szCs w:val="24"/>
-          <w:lang/>
         </w:rPr>
         <w:lastRenderedPageBreak/>
         <w:t xml:space="preserve">         </w:t>
@@ -6239,7 +5471,6 @@
         <w:jc w:val="both"/>
         <w:rPr>
           <w:rFonts w:ascii="Times New Roman" w:eastAsia="Times New Roman" w:hAnsi="Times New Roman" w:cs="Times New Roman"/>
-          <w:lang/>
         </w:rPr>
       </w:pPr>
       <w:r>
@@ -6252,7 +5483,6 @@
       <w:r>
         <w:rPr>
           <w:rFonts w:ascii="Times New Roman" w:eastAsia="Times New Roman" w:hAnsi="Times New Roman" w:cs="Times New Roman"/>
-          <w:lang/>
         </w:rPr>
         <w:t xml:space="preserve">Система підтримує повний життєвий цикл операцій, необхідних для навчання: ініціалізація сесії, вибірка </w:t>
       </w:r>
@@ -6266,9 +5496,36 @@
       <w:r>
         <w:rPr>
           <w:rFonts w:ascii="Times New Roman" w:eastAsia="Times New Roman" w:hAnsi="Times New Roman" w:cs="Times New Roman"/>
-          <w:lang/>
-        </w:rPr>
-        <w:t xml:space="preserve"> за рівнем складності, запис голосового сигналу, конвертація мовлення в текст, асинхронне отримання відповідей від ШІ та збереження прогресу. Для адміністраторів передбачено операції з модифікації навчальних тем, оновлення </w:t>
+        </w:rPr>
+        <w:t xml:space="preserve"> за рівнем складності, запис голосового сигналу, конвертація мовлення в текст, асинхронне отримання відповідей від ШІ та збереження прогресу. Для адміністраторів передбачено операції з модифікації </w:t>
+      </w:r>
+      <w:proofErr w:type="spellStart"/>
+      <w:r>
+        <w:rPr>
+          <w:rFonts w:ascii="Times New Roman" w:eastAsia="Times New Roman" w:hAnsi="Times New Roman" w:cs="Times New Roman"/>
+        </w:rPr>
+        <w:t>навчальних</w:t>
+      </w:r>
+      <w:proofErr w:type="spellEnd"/>
+      <w:r>
+        <w:rPr>
+          <w:rFonts w:ascii="Times New Roman" w:eastAsia="Times New Roman" w:hAnsi="Times New Roman" w:cs="Times New Roman"/>
+        </w:rPr>
+        <w:t xml:space="preserve"> тем, </w:t>
+      </w:r>
+      <w:proofErr w:type="spellStart"/>
+      <w:r>
+        <w:rPr>
+          <w:rFonts w:ascii="Times New Roman" w:eastAsia="Times New Roman" w:hAnsi="Times New Roman" w:cs="Times New Roman"/>
+        </w:rPr>
+        <w:t>оновлення</w:t>
+      </w:r>
+      <w:proofErr w:type="spellEnd"/>
+      <w:r>
+        <w:rPr>
+          <w:rFonts w:ascii="Times New Roman" w:eastAsia="Times New Roman" w:hAnsi="Times New Roman" w:cs="Times New Roman"/>
+        </w:rPr>
+        <w:t xml:space="preserve"> </w:t>
       </w:r>
       <w:proofErr w:type="spellStart"/>
       <w:r>
@@ -6282,9 +5539,36 @@
       <w:r>
         <w:rPr>
           <w:rFonts w:ascii="Times New Roman" w:eastAsia="Times New Roman" w:hAnsi="Times New Roman" w:cs="Times New Roman"/>
-          <w:lang/>
-        </w:rPr>
-        <w:t xml:space="preserve"> через форми редагування та конфігурацію параметрів нарахування XP. </w:t>
+        </w:rPr>
+        <w:t xml:space="preserve"> через </w:t>
+      </w:r>
+      <w:proofErr w:type="spellStart"/>
+      <w:r>
+        <w:rPr>
+          <w:rFonts w:ascii="Times New Roman" w:eastAsia="Times New Roman" w:hAnsi="Times New Roman" w:cs="Times New Roman"/>
+        </w:rPr>
+        <w:t>форми</w:t>
+      </w:r>
+      <w:proofErr w:type="spellEnd"/>
+      <w:r>
+        <w:rPr>
+          <w:rFonts w:ascii="Times New Roman" w:eastAsia="Times New Roman" w:hAnsi="Times New Roman" w:cs="Times New Roman"/>
+        </w:rPr>
+        <w:t xml:space="preserve"> </w:t>
+      </w:r>
+      <w:proofErr w:type="spellStart"/>
+      <w:r>
+        <w:rPr>
+          <w:rFonts w:ascii="Times New Roman" w:eastAsia="Times New Roman" w:hAnsi="Times New Roman" w:cs="Times New Roman"/>
+        </w:rPr>
+        <w:t>редагування</w:t>
+      </w:r>
+      <w:proofErr w:type="spellEnd"/>
+      <w:r>
+        <w:rPr>
+          <w:rFonts w:ascii="Times New Roman" w:eastAsia="Times New Roman" w:hAnsi="Times New Roman" w:cs="Times New Roman"/>
+        </w:rPr>
+        <w:t xml:space="preserve"> та конфігурацію параметрів нарахування XP. </w:t>
       </w:r>
     </w:p>
     <w:p>
@@ -6722,14 +6006,14 @@
         <w:rPr>
           <w:rFonts w:ascii="Times New Roman" w:eastAsia="Times New Roman" w:hAnsi="Times New Roman" w:cs="Times New Roman"/>
         </w:rPr>
-        <w:t xml:space="preserve"> модуль за л</w:t>
-      </w:r>
-      <w:proofErr w:type="spellStart"/>
-      <w:r>
-        <w:rPr>
-          <w:rFonts w:ascii="Times New Roman" w:eastAsia="Times New Roman" w:hAnsi="Times New Roman" w:cs="Times New Roman"/>
-        </w:rPr>
-        <w:t>огіку</w:t>
+        <w:t xml:space="preserve"> модуль за </w:t>
+      </w:r>
+      <w:proofErr w:type="spellStart"/>
+      <w:r>
+        <w:rPr>
+          <w:rFonts w:ascii="Times New Roman" w:eastAsia="Times New Roman" w:hAnsi="Times New Roman" w:cs="Times New Roman"/>
+        </w:rPr>
+        <w:t>логіку</w:t>
       </w:r>
       <w:proofErr w:type="spellEnd"/>
       <w:r>
@@ -7277,7 +6561,6 @@
       <w:r>
         <w:rPr>
           <w:rFonts w:ascii="Times New Roman" w:eastAsia="Times New Roman" w:hAnsi="Times New Roman" w:cs="Times New Roman"/>
-          <w:lang/>
         </w:rPr>
         <w:t xml:space="preserve">Система характеризується високим ступенем адаптивності: складність вправ та </w:t>
       </w:r>
@@ -7291,7 +6574,6 @@
       <w:r>
         <w:rPr>
           <w:rFonts w:ascii="Times New Roman" w:eastAsia="Times New Roman" w:hAnsi="Times New Roman" w:cs="Times New Roman"/>
-          <w:lang/>
         </w:rPr>
         <w:t xml:space="preserve"> у чаті автоматично підлаштовуються під рівень підготовки користувача. Продукт забезпечує цілісність ігрового досвіду, де кожна дія у вправі миттєво синхронізується з профілем та впливає на статус щоденних нагород. Архітектура застосунку дозволяє легко масштабувати навчальний контент без необхідності перезапуску всього сервісу.</w:t>
       </w:r>
@@ -7498,13 +6780,11 @@
         <w:jc w:val="both"/>
         <w:rPr>
           <w:rFonts w:ascii="Times New Roman" w:eastAsia="Times New Roman" w:hAnsi="Times New Roman" w:cs="Times New Roman"/>
-          <w:lang/>
-        </w:rPr>
-      </w:pPr>
-      <w:r>
-        <w:rPr>
-          <w:rFonts w:ascii="Times New Roman" w:eastAsia="Times New Roman" w:hAnsi="Times New Roman" w:cs="Times New Roman"/>
-          <w:lang/>
+        </w:rPr>
+      </w:pPr>
+      <w:r>
+        <w:rPr>
+          <w:rFonts w:ascii="Times New Roman" w:eastAsia="Times New Roman" w:hAnsi="Times New Roman" w:cs="Times New Roman"/>
         </w:rPr>
         <w:t>Система повинна забезпечувати стійкість до відмов та коректно обробляти помилки API. У разі затримок у відповіді від ШІ-провайдера програма впроваджує механізм очікування з інформуванням користувача, запобігаючи зависанню інтерфейсу. База даних SQLite гарантує збереження інформації при раптових відключеннях живлення сервера.</w:t>
       </w:r>
@@ -7586,13 +6866,11 @@
         <w:jc w:val="both"/>
         <w:rPr>
           <w:rFonts w:ascii="Times New Roman" w:eastAsia="Times New Roman" w:hAnsi="Times New Roman" w:cs="Times New Roman"/>
-          <w:lang/>
-        </w:rPr>
-      </w:pPr>
-      <w:r>
-        <w:rPr>
-          <w:rFonts w:ascii="Times New Roman" w:eastAsia="Times New Roman" w:hAnsi="Times New Roman" w:cs="Times New Roman"/>
-          <w:lang/>
+        </w:rPr>
+      </w:pPr>
+      <w:r>
+        <w:rPr>
+          <w:rFonts w:ascii="Times New Roman" w:eastAsia="Times New Roman" w:hAnsi="Times New Roman" w:cs="Times New Roman"/>
         </w:rPr>
         <w:t>Передбачається цілодобова доступність веб-застосунку. Очікуваний рівень працездатності</w:t>
       </w:r>
@@ -7606,7 +6884,6 @@
       <w:r>
         <w:rPr>
           <w:rFonts w:ascii="Times New Roman" w:eastAsia="Times New Roman" w:hAnsi="Times New Roman" w:cs="Times New Roman"/>
-          <w:lang/>
         </w:rPr>
         <w:t>становить не менше 99.5%, за виключенням коротких періодів технічного обслуговування бази даних.</w:t>
       </w:r>
@@ -7704,7 +6981,7 @@
         <w:jc w:val="both"/>
         <w:rPr>
           <w:rFonts w:ascii="Times New Roman" w:eastAsia="Times New Roman" w:hAnsi="Times New Roman" w:cs="Times New Roman"/>
-          <w:lang/>
+          <w:lang w:val="uk-UA"/>
         </w:rPr>
       </w:pPr>
     </w:p>
@@ -7772,7 +7049,6 @@
       <w:r>
         <w:rPr>
           <w:rFonts w:ascii="Times New Roman" w:eastAsia="Times New Roman" w:hAnsi="Times New Roman" w:cs="Times New Roman"/>
-          <w:lang/>
         </w:rPr>
         <w:t>Архітектура програмного коду базується на принципах багатошаровості та чіткого розподілу відповідальності між модулями. Використання системи об’єктно-реляційного відображення дозволяє розробникам вносити зміни у структуру бази даних через механізм міграцій, не ризикуючи втратити існуючу інформацію. Модульна структура компонентів на базі React спрощує процес додавання нових типів вправ або модернізацію інтерфейсу AI-чату, роблячи систему гнучкою до майбутніх розширень функціоналу.</w:t>
       </w:r>
@@ -7789,15 +7065,13 @@
           <w:rFonts w:ascii="Times New Roman" w:eastAsia="Times New Roman" w:hAnsi="Times New Roman" w:cs="Times New Roman"/>
           <w:sz w:val="24"/>
           <w:szCs w:val="24"/>
-          <w:lang/>
-        </w:rPr>
-      </w:pPr>
-      <w:r>
-        <w:rPr>
-          <w:rFonts w:ascii="Times New Roman" w:eastAsia="Times New Roman" w:hAnsi="Times New Roman" w:cs="Times New Roman"/>
-          <w:sz w:val="24"/>
-          <w:szCs w:val="24"/>
-          <w:lang/>
+        </w:rPr>
+      </w:pPr>
+      <w:r>
+        <w:rPr>
+          <w:rFonts w:ascii="Times New Roman" w:eastAsia="Times New Roman" w:hAnsi="Times New Roman" w:cs="Times New Roman"/>
+          <w:sz w:val="24"/>
+          <w:szCs w:val="24"/>
         </w:rPr>
         <w:t xml:space="preserve">         </w:t>
       </w:r>
@@ -7860,13 +7134,11 @@
         <w:jc w:val="both"/>
         <w:rPr>
           <w:rFonts w:ascii="Times New Roman" w:eastAsia="Times New Roman" w:hAnsi="Times New Roman" w:cs="Times New Roman"/>
-          <w:lang/>
-        </w:rPr>
-      </w:pPr>
-      <w:r>
-        <w:rPr>
-          <w:rFonts w:ascii="Times New Roman" w:eastAsia="Times New Roman" w:hAnsi="Times New Roman" w:cs="Times New Roman"/>
-          <w:lang/>
+        </w:rPr>
+      </w:pPr>
+      <w:r>
+        <w:rPr>
+          <w:rFonts w:ascii="Times New Roman" w:eastAsia="Times New Roman" w:hAnsi="Times New Roman" w:cs="Times New Roman"/>
         </w:rPr>
         <w:t>Завдяки використанню кросплатформених технологій Node.js та React, веб</w:t>
       </w:r>
@@ -7880,7 +7152,6 @@
       <w:r>
         <w:rPr>
           <w:rFonts w:ascii="Times New Roman" w:eastAsia="Times New Roman" w:hAnsi="Times New Roman" w:cs="Times New Roman"/>
-          <w:lang/>
         </w:rPr>
         <w:t>застосунок характеризується високим рівнем переносимості. Продукт є сумісним із усіма сучасними браузерами, незалежно від операційної системи чи типу пристрою. Процес розгортання системи на серверному вузлі не вимагає специфічних апаратних налаштувань, що дозволяє легко переносити додаток між різними хостинг-провайдерами або локальними середовищами розробки.</w:t>
       </w:r>
@@ -7964,7 +7235,6 @@
       <w:r>
         <w:rPr>
           <w:rFonts w:ascii="Times New Roman" w:eastAsia="Times New Roman" w:hAnsi="Times New Roman" w:cs="Times New Roman"/>
-          <w:lang/>
         </w:rPr>
         <w:t>Система має забезпечувати мінімальний час відгуку інтерфейсу. Час обробки стандартного запиту на перевірку вправи або отримання статистики сервером не повинен перевищувати 500 мілісекунд. Процеси передачі даних для синтезу мовлення та отримання відповідей від інтелектуального асистента мають бути оптимізовані таким чином, щоб затримка не порушувала природний темп спілкування.</w:t>
       </w:r>
@@ -8076,13 +7346,11 @@
         <w:jc w:val="both"/>
         <w:rPr>
           <w:rFonts w:ascii="Times New Roman" w:eastAsia="Times New Roman" w:hAnsi="Times New Roman" w:cs="Times New Roman"/>
-          <w:lang/>
-        </w:rPr>
-      </w:pPr>
-      <w:r>
-        <w:rPr>
-          <w:rFonts w:ascii="Times New Roman" w:eastAsia="Times New Roman" w:hAnsi="Times New Roman" w:cs="Times New Roman"/>
-          <w:lang/>
+        </w:rPr>
+      </w:pPr>
+      <w:r>
+        <w:rPr>
+          <w:rFonts w:ascii="Times New Roman" w:eastAsia="Times New Roman" w:hAnsi="Times New Roman" w:cs="Times New Roman"/>
         </w:rPr>
         <w:t>Реляційна структура бази даних на базі SQLite повинна гарантувати повну цілісність та логічну зв'язність інформації. Архітектура сховища охоплює таблиці для збереження профілів користувачів, ігрових показників, персональних статистичних даних та навчальних завдань. Зв’язки між сутностями повинні контролюватися на рівні механізмів зовнішніх ключів. Система має підтримувати унікальність ідентифікаторів користувачів для запобігання дублюванню записів у статистиці та забезпечувати високу швидкість виконання запитів при побудові глобальних рейтингів.</w:t>
       </w:r>
@@ -8189,27 +7457,23 @@
         <w:jc w:val="both"/>
         <w:rPr>
           <w:rFonts w:ascii="Times New Roman" w:eastAsia="Times New Roman" w:hAnsi="Times New Roman" w:cs="Times New Roman"/>
-          <w:lang/>
-        </w:rPr>
-      </w:pPr>
-      <w:r>
-        <w:rPr>
-          <w:rFonts w:ascii="Times New Roman" w:eastAsia="Times New Roman" w:hAnsi="Times New Roman" w:cs="Times New Roman"/>
-          <w:lang/>
+        </w:rPr>
+      </w:pPr>
+      <w:r>
+        <w:rPr>
+          <w:rFonts w:ascii="Times New Roman" w:eastAsia="Times New Roman" w:hAnsi="Times New Roman" w:cs="Times New Roman"/>
         </w:rPr>
         <w:t>Процес розробки системи супроводжується використанням системи контролю версій Git із детальним документуванням кожного етапу змін. Програмний код має відповідати галузевим стандартам якості, мати модульну структуру</w:t>
       </w:r>
       <w:r>
         <w:rPr>
           <w:rFonts w:ascii="Times New Roman" w:eastAsia="Times New Roman" w:hAnsi="Times New Roman" w:cs="Times New Roman"/>
-          <w:lang/>
         </w:rPr>
         <w:t>, що</w:t>
       </w:r>
       <w:r>
         <w:rPr>
           <w:rFonts w:ascii="Times New Roman" w:eastAsia="Times New Roman" w:hAnsi="Times New Roman" w:cs="Times New Roman"/>
-          <w:lang/>
         </w:rPr>
         <w:t xml:space="preserve"> забезпечує прозорість проєкту для подальшого аудиту та полегшує технічну підтримку програмної системи у довгостроковій перспективі.</w:t>
       </w:r>
@@ -8224,7 +7488,6 @@
         <w:jc w:val="both"/>
         <w:rPr>
           <w:rFonts w:ascii="Times New Roman" w:eastAsia="Times New Roman" w:hAnsi="Times New Roman" w:cs="Times New Roman"/>
-          <w:lang/>
         </w:rPr>
       </w:pPr>
     </w:p>
@@ -8236,9 +7499,6 @@
         <w:spacing w:line="360" w:lineRule="auto"/>
         <w:ind w:right="720"/>
         <w:jc w:val="both"/>
-        <w:rPr>
-          <w:lang/>
-        </w:rPr>
       </w:pPr>
     </w:p>
     <w:sectPr>
@@ -10206,6 +9466,7 @@
   <w:style w:type="character" w:default="1" w:styleId="a0">
     <w:name w:val="Default Paragraph Font"/>
     <w:uiPriority w:val="1"/>
+    <w:semiHidden/>
     <w:unhideWhenUsed/>
   </w:style>
   <w:style w:type="table" w:default="1" w:styleId="a1">

</xml_diff>